<commit_message>
data: 行情更新至 2026-10-30 收盘
- 延长 1 个交易日：3,984 日，收盘 2,413.63（前一日 2,517.59，单日 -4.13%）
- 现状刷新：连续 6 个完整下跌周（-28.44%）、回撤 -44.79%（16 年第三深）
- 统计结论未变：基准率 42.2%、C1 收缩后 49.1%、4 个类比样本、9 段熊市
- 修正：百分比统一为 U+2212 减号；图表样本量改为动态取值，去掉硬编码 3,963
- 方案文档标记为 10-29 数据存档，不再重新生成
</commit_message>
<xml_diff>
--- a/out/创业板反弹概率_快速版_2026-10.docx
+++ b/out/创业板反弹概率_快速版_2026-10.docx
@@ -25,7 +25,7 @@
           <w:color w:val="6F6A61"/>
           <w:sz w:val="18"/>
         </w:rPr>
-        <w:t>口径：20 个交易日内收盘反弹 ≥5%　|　基准日 2026-10-29 收盘 2,517.59　|　样本 3,983 交易日</w:t>
+        <w:t>口径：20 个交易日内收盘反弹 ≥5%　|　基准日 2026-10-30 收盘 2,413.63　|　样本 3,984 交易日</w:t>
       </w:r>
     </w:p>
     <w:p>
@@ -62,7 +62,7 @@
           <w:b w:val="0"/>
           <w:sz w:val="21"/>
         </w:rPr>
-        <w:t>当前状态：距 2026-06-25 高点回撤 −42.4%（16 年第三深），已确认 5 个完整下跌周（累计 −20.42%），20 日跌幅 −25.5%（历史第 0.6 百分位），20 日年化波动率 37%（历史第 83 百分位）。</w:t>
+        <w:t>当前状态：距 2026-06-25 高点回撤 −44.8%（16 年第三深），已确认 6 个完整下跌周（累计 −28.44%），20 日跌幅 −26.6%（历史第 0.5 百分位），20 日年化波动率 38%（历史第 84 百分位）。</w:t>
       </w:r>
     </w:p>
     <w:p>
@@ -255,7 +255,7 @@
               <w:rPr>
                 <w:sz w:val="18"/>
               </w:rPr>
-              <w:t>3,963</w:t>
+              <w:t>3,964</w:t>
             </w:r>
           </w:p>
         </w:tc>
@@ -283,7 +283,7 @@
               <w:rPr>
                 <w:sz w:val="18"/>
               </w:rPr>
-              <w:t>40.7–43.8%</w:t>
+              <w:t>40.7–43.7%</w:t>
             </w:r>
           </w:p>
         </w:tc>
@@ -683,7 +683,7 @@
               <w:rPr>
                 <w:sz w:val="18"/>
               </w:rPr>
-              <w:t>41.2–70.2%</w:t>
+              <w:t>41.2–70.1%</w:t>
             </w:r>
           </w:p>
         </w:tc>
@@ -2319,7 +2319,7 @@
               <w:rPr>
                 <w:sz w:val="18"/>
               </w:rPr>
-              <w:t>2026-06-25 → 2026-10-29</w:t>
+              <w:t>2026-06-25 → 2026-10-30</w:t>
             </w:r>
           </w:p>
         </w:tc>
@@ -2333,7 +2333,7 @@
               <w:rPr>
                 <w:sz w:val="18"/>
               </w:rPr>
-              <w:t>-42.4%</w:t>
+              <w:t>-44.8%</w:t>
             </w:r>
           </w:p>
         </w:tc>
@@ -2347,7 +2347,7 @@
               <w:rPr>
                 <w:sz w:val="18"/>
               </w:rPr>
-              <w:t>84</w:t>
+              <w:t>85</w:t>
             </w:r>
           </w:p>
         </w:tc>
@@ -2361,7 +2361,7 @@
               <w:rPr>
                 <w:sz w:val="18"/>
               </w:rPr>
-              <w:t>-10.1%</w:t>
+              <w:t>-10.5%</w:t>
             </w:r>
           </w:p>
         </w:tc>
@@ -2375,7 +2375,7 @@
               <w:rPr>
                 <w:sz w:val="18"/>
               </w:rPr>
-              <w:t>43.1%</w:t>
+              <w:t>43.3%</w:t>
             </w:r>
           </w:p>
         </w:tc>
@@ -2419,7 +2419,7 @@
           <w:color w:val="4A453F"/>
           <w:sz w:val="18"/>
         </w:rPr>
-        <w:t>当前段 −10.1%/月，快于任何一段慢熊（−1.6 至 −7.3%/月），慢于 2015 年 6–7 月的崩塌（−35.6%/月）。波动率 43.1% 仍处高位——底部通常伴随波动衰减，目前未见。缩量 0.81x 在历史上并不构成见底信号。</w:t>
+        <w:t>当前段 −10.5%/月，快于任何一段慢熊（−1.6 至 −7.3%/月），慢于 2015 年 6–7 月的崩塌（−35.6%/月）。波动率 43.1% 仍处高位——底部通常伴随波动衰减，目前未见。缩量 0.81x 在历史上并不构成见底信号。</w:t>
       </w:r>
     </w:p>
     <w:p>
@@ -2594,7 +2594,7 @@
               <w:rPr>
                 <w:sz w:val="18"/>
               </w:rPr>
-              <w:t>43% 年化，历史 83 分位，未见衰减</w:t>
+              <w:t>38% 年化，历史 84 分位，未见衰减</w:t>
             </w:r>
           </w:p>
         </w:tc>
@@ -2727,7 +2727,7 @@
           <w:color w:val="6F6A61"/>
           <w:sz w:val="18"/>
         </w:rPr>
-        <w:t>数据：创业板指 399006 日收盘，2010-06-02 至 2026-10-29，3,983 个交易日；腾讯 ifzq 取数，新浪在 1,023 个重叠交易日逐日比对，差异 &gt;0.05 元的为 0 天。</w:t>
+        <w:t>数据：创业板指 399006 日收盘，2010-06-02 至 2026-10-30，3,984 个交易日；腾讯 ifzq 取数，新浪在 1,023 个重叠交易日逐日比对，差异 &gt;0.05 元的为 0 天。</w:t>
       </w:r>
     </w:p>
     <w:p>

</xml_diff>